<commit_message>
Manual: Q15 passa a citar 3 recusas por VPN ou IP de fora do Brasil
Co-Authored-By: Claude Sonnet 5.5 <noreply@anthropic.com>
Claude-Session: https://claude.ai/code/session_01CjFj7wkh24wesx66nJGRuW
</commit_message>
<xml_diff>
--- a/manual/Manual_Suporte_Fenix_corrigido.docx
+++ b/manual/Manual_Suporte_Fenix_corrigido.docx
@@ -6894,25 +6894,23 @@
           <w:szCs w:val="18"/>
           <w:rtl w:val="0"/>
         </w:rPr>
-        <w:t xml:space="preserve">→ </w:t>
-      </w:r>
-      <w:r>
-        <w:rPr>
-          <w:b w:val="1"/>
-          <w:bCs w:val="1"/>
-          <w:sz w:val="18"/>
-          <w:szCs w:val="18"/>
-          <w:rtl w:val="0"/>
-        </w:rPr>
-        <w:t xml:space="preserve">VPN:</w:t>
-      </w:r>
-      <w:r>
-        <w:rPr>
-          <w:sz w:val="18"/>
-          <w:szCs w:val="18"/>
-          <w:rtl w:val="0"/>
-        </w:rPr>
-        <w:t xml:space="preserve"> 3 recusas em 24 horas.</w:t>
+        <w:t>→ VPN: 3 recusas por VPN ou IP de fora do Brasil em 24 horas.</w:t>
+      </w:r>
+      <w:r>
+        <w:rPr>
+          <w:b w:val="1"/>
+          <w:bCs w:val="1"/>
+          <w:sz w:val="18"/>
+          <w:szCs w:val="18"/>
+          <w:rtl w:val="0"/>
+        </w:rPr>
+      </w:r>
+      <w:r>
+        <w:rPr>
+          <w:sz w:val="18"/>
+          <w:szCs w:val="18"/>
+          <w:rtl w:val="0"/>
+        </w:rPr>
       </w:r>
       <w:r>
         <w:rPr>

</xml_diff>